<commit_message>
adding module-2/HTML and CSS file
</commit_message>
<xml_diff>
--- a/module-1/assignment-3/Shrestha-assignment1.3-screenshots.docx
+++ b/module-1/assignment-3/Shrestha-assignment1.3-screenshots.docx
@@ -17,7 +17,6 @@
         <w:t>Module 1.3 Assignment</w:t>
       </w:r>
     </w:p>
-    <w:p/>
     <w:p/>
     <w:p>
       <w:r>
@@ -66,6 +65,7 @@
         </w:drawing>
       </w:r>
     </w:p>
+    <w:p/>
     <w:p/>
     <w:p/>
     <w:p>
@@ -116,18 +116,89 @@
         </w:drawing>
       </w:r>
     </w:p>
+    <w:p/>
+    <w:p/>
+    <w:p/>
+    <w:p/>
+    <w:p/>
+    <w:p/>
+    <w:p/>
+    <w:p/>
+    <w:p/>
+    <w:p/>
+    <w:p/>
     <w:p>
       <w:r>
+        <w:lastRenderedPageBreak/>
+        <w:t>3. Final validator after adding content</w:t>
+      </w:r>
+    </w:p>
+    <w:p>
+      <w:r>
+        <w:rPr>
+          <w:noProof/>
+        </w:rPr>
+        <w:drawing>
+          <wp:inline distT="0" distB="0" distL="0" distR="0" wp14:anchorId="46BD5757" wp14:editId="4C0ACD39">
+            <wp:extent cx="5943600" cy="5358130"/>
+            <wp:effectExtent l="0" t="0" r="0" b="0"/>
+            <wp:docPr id="681517786" name="Picture 1"/>
+            <wp:cNvGraphicFramePr>
+              <a:graphicFrameLocks xmlns:a="http://schemas.openxmlformats.org/drawingml/2006/main" noChangeAspect="1"/>
+            </wp:cNvGraphicFramePr>
+            <a:graphic xmlns:a="http://schemas.openxmlformats.org/drawingml/2006/main">
+              <a:graphicData uri="http://schemas.openxmlformats.org/drawingml/2006/picture">
+                <pic:pic xmlns:pic="http://schemas.openxmlformats.org/drawingml/2006/picture">
+                  <pic:nvPicPr>
+                    <pic:cNvPr id="681517786" name=""/>
+                    <pic:cNvPicPr/>
+                  </pic:nvPicPr>
+                  <pic:blipFill>
+                    <a:blip r:embed="rId6"/>
+                    <a:stretch>
+                      <a:fillRect/>
+                    </a:stretch>
+                  </pic:blipFill>
+                  <pic:spPr>
+                    <a:xfrm>
+                      <a:off x="0" y="0"/>
+                      <a:ext cx="5943600" cy="5358130"/>
+                    </a:xfrm>
+                    <a:prstGeom prst="rect">
+                      <a:avLst/>
+                    </a:prstGeom>
+                  </pic:spPr>
+                </pic:pic>
+              </a:graphicData>
+            </a:graphic>
+          </wp:inline>
+        </w:drawing>
+      </w:r>
+    </w:p>
+    <w:p/>
+    <w:p/>
+    <w:p/>
+    <w:p/>
+    <w:p/>
+    <w:p/>
+    <w:p/>
+    <w:p/>
+    <w:p>
+      <w:r>
+        <w:lastRenderedPageBreak/>
         <w:t>4. Webpage in browser</w:t>
       </w:r>
     </w:p>
     <w:p>
       <w:r>
+        <w:rPr>
+          <w:noProof/>
+        </w:rPr>
         <w:drawing>
-          <wp:inline distT="0" distB="0" distL="0" distR="0" wp14:anchorId="271EC7CD" wp14:editId="02B5E201">
+          <wp:inline distT="0" distB="0" distL="0" distR="0" wp14:anchorId="679E3CFC" wp14:editId="3C9683C3">
             <wp:extent cx="5943600" cy="2867660"/>
             <wp:effectExtent l="0" t="0" r="0" b="8890"/>
-            <wp:docPr id="856444807" name="Picture 1"/>
+            <wp:docPr id="1419288251" name="Picture 1"/>
             <wp:cNvGraphicFramePr>
               <a:graphicFrameLocks xmlns:a="http://schemas.openxmlformats.org/drawingml/2006/main" noChangeAspect="1"/>
             </wp:cNvGraphicFramePr>
@@ -139,7 +210,7 @@
                     <pic:cNvPicPr/>
                   </pic:nvPicPr>
                   <pic:blipFill>
-                    <a:blip r:embed="rId6"/>
+                    <a:blip r:embed="rId7"/>
                     <a:stretch>
                       <a:fillRect/>
                     </a:stretch>
@@ -162,62 +233,6 @@
     </w:p>
     <w:p/>
     <w:p/>
-    <w:p/>
-    <w:p/>
-    <w:p/>
-    <w:p/>
-    <w:p/>
-    <w:p/>
-    <w:p/>
-    <w:p/>
-    <w:p>
-      <w:r>
-        <w:t>3. Final validator after adding content</w:t>
-      </w:r>
-    </w:p>
-    <w:p>
-      <w:r>
-        <w:rPr>
-          <w:noProof/>
-        </w:rPr>
-        <w:lastRenderedPageBreak/>
-        <w:drawing>
-          <wp:inline distT="0" distB="0" distL="0" distR="0" wp14:anchorId="46BD5757" wp14:editId="4C0ACD39">
-            <wp:extent cx="5943600" cy="5358130"/>
-            <wp:effectExtent l="0" t="0" r="0" b="0"/>
-            <wp:docPr id="681517786" name="Picture 1"/>
-            <wp:cNvGraphicFramePr>
-              <a:graphicFrameLocks xmlns:a="http://schemas.openxmlformats.org/drawingml/2006/main" noChangeAspect="1"/>
-            </wp:cNvGraphicFramePr>
-            <a:graphic xmlns:a="http://schemas.openxmlformats.org/drawingml/2006/main">
-              <a:graphicData uri="http://schemas.openxmlformats.org/drawingml/2006/picture">
-                <pic:pic xmlns:pic="http://schemas.openxmlformats.org/drawingml/2006/picture">
-                  <pic:nvPicPr>
-                    <pic:cNvPr id="681517786" name=""/>
-                    <pic:cNvPicPr/>
-                  </pic:nvPicPr>
-                  <pic:blipFill>
-                    <a:blip r:embed="rId7"/>
-                    <a:stretch>
-                      <a:fillRect/>
-                    </a:stretch>
-                  </pic:blipFill>
-                  <pic:spPr>
-                    <a:xfrm>
-                      <a:off x="0" y="0"/>
-                      <a:ext cx="5943600" cy="5358130"/>
-                    </a:xfrm>
-                    <a:prstGeom prst="rect">
-                      <a:avLst/>
-                    </a:prstGeom>
-                  </pic:spPr>
-                </pic:pic>
-              </a:graphicData>
-            </a:graphic>
-          </wp:inline>
-        </w:drawing>
-      </w:r>
-    </w:p>
     <w:sectPr>
       <w:pgSz w:w="12240" w:h="15840"/>
       <w:pgMar w:top="1440" w:right="1440" w:bottom="1440" w:left="1440" w:header="720" w:footer="720" w:gutter="0"/>
@@ -1145,6 +1160,29 @@
       <w:spacing w:val="5"/>
     </w:rPr>
   </w:style>
+  <w:style w:type="character" w:styleId="Hyperlink">
+    <w:name w:val="Hyperlink"/>
+    <w:basedOn w:val="DefaultParagraphFont"/>
+    <w:uiPriority w:val="99"/>
+    <w:unhideWhenUsed/>
+    <w:rsid w:val="006A0D4D"/>
+    <w:rPr>
+      <w:color w:val="467886" w:themeColor="hyperlink"/>
+      <w:u w:val="single"/>
+    </w:rPr>
+  </w:style>
+  <w:style w:type="character" w:styleId="UnresolvedMention">
+    <w:name w:val="Unresolved Mention"/>
+    <w:basedOn w:val="DefaultParagraphFont"/>
+    <w:uiPriority w:val="99"/>
+    <w:semiHidden/>
+    <w:unhideWhenUsed/>
+    <w:rsid w:val="006A0D4D"/>
+    <w:rPr>
+      <w:color w:val="605E5C"/>
+      <w:shd w:val="clear" w:color="auto" w:fill="E1DFDD"/>
+    </w:rPr>
+  </w:style>
 </w:styles>
 </file>
 

</xml_diff>